<commit_message>
task 3 corrected (2)
added source triplets for all tables.
ce_cashier has SCD2. others - SCD1
</commit_message>
<xml_diff>
--- a/Business_Template.docx
+++ b/Business_Template.docx
@@ -5288,10 +5288,10 @@
       </w:pPr>
       <w:r>
         <w:drawing>
-          <wp:inline distT="0" distB="0" distL="0" distR="0" wp14:anchorId="797E5D0A" wp14:editId="11A5A4BB">
-            <wp:extent cx="5941695" cy="5621655"/>
-            <wp:effectExtent l="0" t="0" r="1905" b="0"/>
-            <wp:docPr id="928744920" name="Picture 1"/>
+          <wp:inline distT="0" distB="0" distL="0" distR="0" wp14:anchorId="0EA60226" wp14:editId="6D017000">
+            <wp:extent cx="5941695" cy="4092575"/>
+            <wp:effectExtent l="0" t="0" r="1905" b="3175"/>
+            <wp:docPr id="2136989468" name="Picture 1"/>
             <wp:cNvGraphicFramePr>
               <a:graphicFrameLocks xmlns:a="http://schemas.openxmlformats.org/drawingml/2006/main" noChangeAspect="1"/>
             </wp:cNvGraphicFramePr>
@@ -5299,7 +5299,7 @@
               <a:graphicData uri="http://schemas.openxmlformats.org/drawingml/2006/picture">
                 <pic:pic xmlns:pic="http://schemas.openxmlformats.org/drawingml/2006/picture">
                   <pic:nvPicPr>
-                    <pic:cNvPr id="928744920" name=""/>
+                    <pic:cNvPr id="2136989468" name=""/>
                     <pic:cNvPicPr/>
                   </pic:nvPicPr>
                   <pic:blipFill>
@@ -5311,7 +5311,7 @@
                   <pic:spPr>
                     <a:xfrm>
                       <a:off x="0" y="0"/>
-                      <a:ext cx="5941695" cy="5621655"/>
+                      <a:ext cx="5941695" cy="4092575"/>
                     </a:xfrm>
                     <a:prstGeom prst="rect">
                       <a:avLst/>
@@ -5422,7 +5422,6 @@
       <w:bookmarkStart w:id="22" w:name="_Toc155614193"/>
       <w:bookmarkEnd w:id="20"/>
       <w:r>
-        <w:lastRenderedPageBreak/>
         <w:t>Business Layer Dimensional Model</w:t>
       </w:r>
       <w:bookmarkEnd w:id="22"/>
@@ -10660,6 +10659,15 @@
 </file>
 
 <file path=customXml/item2.xml><?xml version="1.0" encoding="utf-8"?>
+<?mso-contentType ?>
+<FormTemplates xmlns="http://schemas.microsoft.com/sharepoint/v3/contenttype/forms">
+  <Display>DocumentLibraryForm</Display>
+  <Edit>DocumentLibraryForm</Edit>
+  <New>DocumentLibraryForm</New>
+</FormTemplates>
+</file>
+
+<file path=customXml/item3.xml><?xml version="1.0" encoding="utf-8"?>
 <p:properties xmlns:p="http://schemas.microsoft.com/office/2006/metadata/properties" xmlns:xsi="http://www.w3.org/2001/XMLSchema-instance" xmlns:pc="http://schemas.microsoft.com/office/infopath/2007/PartnerControls">
   <documentManagement>
     <SharedWithUsers xmlns="7f0dcb33-685e-48d8-b644-2ef2786c1229">
@@ -10671,15 +10679,6 @@
     </SharedWithUsers>
   </documentManagement>
 </p:properties>
-</file>
-
-<file path=customXml/item3.xml><?xml version="1.0" encoding="utf-8"?>
-<?mso-contentType ?>
-<FormTemplates xmlns="http://schemas.microsoft.com/sharepoint/v3/contenttype/forms">
-  <Display>DocumentLibraryForm</Display>
-  <Edit>DocumentLibraryForm</Edit>
-  <New>DocumentLibraryForm</New>
-</FormTemplates>
 </file>
 
 <file path=customXml/itemProps1.xml><?xml version="1.0" encoding="utf-8"?>
@@ -10702,6 +10701,14 @@
 </file>
 
 <file path=customXml/itemProps2.xml><?xml version="1.0" encoding="utf-8"?>
+<ds:datastoreItem xmlns:ds="http://schemas.openxmlformats.org/officeDocument/2006/customXml" ds:itemID="{CEAD825D-2413-46BA-BB1F-DCE637B19B0C}">
+  <ds:schemaRefs>
+    <ds:schemaRef ds:uri="http://schemas.microsoft.com/sharepoint/v3/contenttype/forms"/>
+  </ds:schemaRefs>
+</ds:datastoreItem>
+</file>
+
+<file path=customXml/itemProps3.xml><?xml version="1.0" encoding="utf-8"?>
 <ds:datastoreItem xmlns:ds="http://schemas.openxmlformats.org/officeDocument/2006/customXml" ds:itemID="{E4B4D352-B35B-4B3A-95D2-902933709BD2}">
   <ds:schemaRefs>
     <ds:schemaRef ds:uri="http://schemas.microsoft.com/office/2006/metadata/properties"/>
@@ -10709,12 +10716,4 @@
     <ds:schemaRef ds:uri="7f0dcb33-685e-48d8-b644-2ef2786c1229"/>
   </ds:schemaRefs>
 </ds:datastoreItem>
-</file>
-
-<file path=customXml/itemProps3.xml><?xml version="1.0" encoding="utf-8"?>
-<ds:datastoreItem xmlns:ds="http://schemas.openxmlformats.org/officeDocument/2006/customXml" ds:itemID="{CEAD825D-2413-46BA-BB1F-DCE637B19B0C}">
-  <ds:schemaRefs>
-    <ds:schemaRef ds:uri="http://schemas.microsoft.com/sharepoint/v3/contenttype/forms"/>
-  </ds:schemaRefs>
-</ds:datastoreItem>
 </file>
</xml_diff>